<commit_message>
docs: beta guide leads with the beta front door only
Co-Authored-By: Claude Fable 5.1 <noreply@anthropic.com>
</commit_message>
<xml_diff>
--- a/docs/FLP_Beta_Preview_Guide.docx
+++ b/docs/FLP_Beta_Preview_Guide.docx
@@ -98,12 +98,11 @@
     </w:p>
     <w:p>
       <w:pPr>
-        <w:numPr>
-          <w:ilvl w:val="0"/>
-          <w:numId w:val="1"/>
-        </w:numPr>
-        <w:spacing w:after="80"/>
-      </w:pPr>
+        <w:spacing w:after="140"/>
+      </w:pPr>
+      <w:r>
+        <w:t xml:space="preserve">Start at </w:t>
+      </w:r>
       <w:r>
         <w:rPr>
           <w:b/>
@@ -111,34 +110,12 @@
         <w:t xml:space="preserve">beta.firstlineperform.com</w:t>
       </w:r>
       <w:r>
-        <w:t xml:space="preserve"> is the front door: the public pages. Placeholder copy, hidden from search engines. Every button on it opens the product.</w:t>
-      </w:r>
-    </w:p>
-    <w:p>
-      <w:pPr>
-        <w:numPr>
-          <w:ilvl w:val="0"/>
-          <w:numId w:val="1"/>
-        </w:numPr>
-        <w:spacing w:after="80"/>
-      </w:pPr>
-      <w:r>
-        <w:rPr>
-          <w:b/>
-        </w:rPr>
-        <w:t xml:space="preserve">app.firstlineperform.com</w:t>
-      </w:r>
-      <w:r>
-        <w:t xml:space="preserve"> is the product itself: sign-up, the marketplace, ordering, film, Film Rooms, the admin control center.</w:t>
-      </w:r>
-    </w:p>
-    <w:p>
-      <w:pPr>
-        <w:numPr>
-          <w:ilvl w:val="0"/>
-          <w:numId w:val="1"/>
-        </w:numPr>
-        <w:spacing w:after="80"/>
+        <w:t xml:space="preserve">. That's the front door: the public pages, placeholder copy, hidden from search engines. Every button on it (Browse FLP Mentors, Create a parent account, Apply, Sign in) carries you into the product. You never need to type any other address; the product's own address shows in the bar once you're in, and it's the same one the finished platform keeps after launch, so your sign-in emails and bookmarks from this week still work in November.</w:t>
+      </w:r>
+    </w:p>
+    <w:p>
+      <w:pPr>
+        <w:spacing w:after="140"/>
       </w:pPr>
       <w:r>
         <w:t xml:space="preserve">Phone or laptop, both work. It's built laptop-first, phone second, so the laptop is the better first look.</w:t>
@@ -146,11 +123,7 @@
     </w:p>
     <w:p>
       <w:pPr>
-        <w:numPr>
-          <w:ilvl w:val="0"/>
-          <w:numId w:val="1"/>
-        </w:numPr>
-        <w:spacing w:after="80"/>
+        <w:spacing w:after="140"/>
       </w:pPr>
       <w:r>
         <w:rPr>
@@ -195,7 +168,16 @@
         <w:spacing w:after="80"/>
       </w:pPr>
       <w:r>
-        <w:t xml:space="preserve">Go to app.firstlineperform.com/sign-up and create a parent account with your @firstlineperform.com address.</w:t>
+        <w:t xml:space="preserve">From beta.firstlineperform.com, tap </w:t>
+      </w:r>
+      <w:r>
+        <w:rPr>
+          <w:b/>
+        </w:rPr>
+        <w:t xml:space="preserve">Create a parent account</w:t>
+      </w:r>
+      <w:r>
+        <w:t xml:space="preserve"> and sign up with your @firstlineperform.com address.</w:t>
       </w:r>
     </w:p>
     <w:p>
@@ -257,7 +239,7 @@
         <w:t xml:space="preserve">Apply</w:t>
       </w:r>
       <w:r>
-        <w:t xml:space="preserve"> (or go straight to app.firstlineperform.com/apply). Use a personal email address. Fill it in, confirm the email, sign in.</w:t>
+        <w:t xml:space="preserve">. Use a personal email address. Fill it in, confirm the email, sign in.</w:t>
       </w:r>
     </w:p>
     <w:p>

</xml_diff>

<commit_message>
docs: beta guide rebuilt from Scott's edited doc
Co-Authored-By: Claude Fable 5.1 <noreply@anthropic.com>
</commit_message>
<xml_diff>
--- a/docs/FLP_Beta_Preview_Guide.docx
+++ b/docs/FLP_Beta_Preview_Guide.docx
@@ -12,7 +12,7 @@
           <w:color w:val="B8891F"/>
           <w:sz w:val="17"/>
         </w:rPr>
-        <w:t xml:space="preserve">First Line Performance · Beta preview guide · September 2026</w:t>
+        <w:t xml:space="preserve">First Line Performance · Beta preview guide · September 23, 2026 · Scott Maslowe</w:t>
       </w:r>
     </w:p>
     <w:p>
@@ -25,13 +25,10 @@
     </w:p>
     <w:p>
       <w:pPr>
-        <w:spacing w:after="160"/>
-      </w:pPr>
-      <w:r>
-        <w:rPr>
-          <w:sz w:val="23"/>
-        </w:rPr>
-        <w:t xml:space="preserve">Alex, Bryan: the platform is live on our beta servers, and it's the real thing. Real database, real video, real emails from your domain, real recordings. Everything you do on it persists. Before you dive in, three things so you see it the way I do.</w:t>
+        <w:spacing w:after="140"/>
+      </w:pPr>
+      <w:r>
+        <w:t xml:space="preserve">Alex, Bryan: the platform is live on our beta servers, I wanted to send it today because I know it's just plain fun to see your visions become digital reality, and it gives you time to poke around before Sunday's review. Everything you do on it persists, but any Admin can delete anything you make that needs to be pruned as far as mentors or profiles. Keep in mind when you change things on the administrative panel settings page, those are real settings changes. I have multiple "go back to safe settings" features, so just be aware, but don't sweat it. Before you dive in, three things so you see it the way I do.</w:t>
       </w:r>
     </w:p>
     <w:p>
@@ -49,7 +46,7 @@
         <w:t xml:space="preserve">The look is light on purpose.</w:t>
       </w:r>
       <w:r>
-        <w:t xml:space="preserve"> What you're seeing is the working skeleton in the brand colors. The high-resolution, high-quality design pass comes after we meet and settle a few key points. Judge the flow, not the polish.</w:t>
+        <w:t xml:space="preserve"> What you're seeing is the working design skeleton in the brand colors. The high-resolution, high-quality design pass comes after we meet and discuss what we want the final pass to look like. Judge the flow, not the polish.</w:t>
       </w:r>
     </w:p>
     <w:p>
@@ -67,7 +64,7 @@
         <w:t xml:space="preserve">The copy is rudimentary.</w:t>
       </w:r>
       <w:r>
-        <w:t xml:space="preserve"> Every headline, paragraph and email on the site and in the app was written to fill space. One of you needs to author it properly. When you're ready, we go page by page.</w:t>
+        <w:t xml:space="preserve"> Every headline, paragraph and email on the site and in the app was written to fill space. One of you needs to author it properly. I can also ask Claude with my developer account to do it from notes you make.</w:t>
       </w:r>
     </w:p>
     <w:p>
@@ -85,7 +82,7 @@
         <w:t xml:space="preserve">Some of the deeper functionality is still to be wired.</w:t>
       </w:r>
       <w:r>
-        <w:t xml:space="preserve"> Payments run in a free preview mode, so nothing is charged. The native iPhone and Android apps come in weeks 7 and 8. The legal pages are drafts. The finer rules are set to sensible defaults. Review the base functionality, we discuss it, then I wire the rest to match what you decide.</w:t>
+        <w:t xml:space="preserve"> Payments run in a free preview mode, so nothing is charged. The native iPhone and Android apps come in weeks 7 and 8. The legal pages are drafts. The finer rules are set to sensible defaults. Review the base functionality, tell me "this is what we want" or "these changes need to be made", and once that pass is finished, we can get into some of the detailed functionality.</w:t>
       </w:r>
     </w:p>
     <w:p>
@@ -110,7 +107,7 @@
         <w:t xml:space="preserve">beta.firstlineperform.com</w:t>
       </w:r>
       <w:r>
-        <w:t xml:space="preserve">. That's the front door: the public pages, placeholder copy, hidden from search engines. Every button on it (Browse FLP Mentors, Create a parent account, Apply, Sign in) carries you into the product. You never need to type any other address; the product's own address shows in the bar once you're in, and it's the same one the finished platform keeps after launch, so your sign-in emails and bookmarks from this week still work in November.</w:t>
+        <w:t xml:space="preserve">. That's the front door: the public pages, placeholder copy, hidden from search engines. This WILL work though if you want to let an athlete demo the service. I would wait until after Sunday to do that, in case you find any bugs or flow control issues.</w:t>
       </w:r>
     </w:p>
     <w:p>
@@ -132,7 +129,7 @@
         <w:t xml:space="preserve">firstlineperform.com</w:t>
       </w:r>
       <w:r>
-        <w:t xml:space="preserve"> still shows the coming-soon page. That doesn't change until we say so.</w:t>
+        <w:t xml:space="preserve"> still shows the coming-soon page. That doesn't change until you say so.</w:t>
       </w:r>
     </w:p>
     <w:p>
@@ -711,7 +708,59 @@
         <w:pStyle w:val="Heading2"/>
       </w:pPr>
       <w:r>
-        <w:t xml:space="preserve">About the Hanson brothers</w:t>
+        <w:t xml:space="preserve">I think you're gonna like the demo mentors... But if you don't get it, it means I'm old as fuck and you're not.</w:t>
+      </w:r>
+    </w:p>
+    <w:p>
+      <w:pPr>
+        <w:pStyle w:val="Heading2"/>
+      </w:pPr>
+      <w:r>
+        <w:t xml:space="preserve">What's real and what isn't, today</w:t>
+      </w:r>
+    </w:p>
+    <w:p>
+      <w:pPr>
+        <w:numPr>
+          <w:ilvl w:val="0"/>
+          <w:numId w:val="1"/>
+        </w:numPr>
+        <w:spacing w:after="80"/>
+      </w:pPr>
+      <w:r>
+        <w:rPr>
+          <w:b/>
+        </w:rPr>
+        <w:t xml:space="preserve">Real:</w:t>
+      </w:r>
+      <w:r>
+        <w:t xml:space="preserve"> accounts, youth athletes, orders, uploads, breakdowns, worksheets and PDFs, ratings, audits, Film Rooms and their recordings, every email, the admin panel. It all persists.</w:t>
+      </w:r>
+    </w:p>
+    <w:p>
+      <w:pPr>
+        <w:numPr>
+          <w:ilvl w:val="0"/>
+          <w:numId w:val="1"/>
+        </w:numPr>
+        <w:spacing w:after="80"/>
+      </w:pPr>
+      <w:r>
+        <w:rPr>
+          <w:b/>
+        </w:rPr>
+        <w:t xml:space="preserve">Not yet:</w:t>
+      </w:r>
+      <w:r>
+        <w:t xml:space="preserve"> charging cards and paying mentors through Stripe. Few lines of code left after we make the stripe account.</w:t>
+      </w:r>
+    </w:p>
+    <w:p>
+      <w:pPr>
+        <w:pStyle w:val="Heading2"/>
+      </w:pPr>
+      <w:r>
+        <w:t xml:space="preserve">How to give feedback</w:t>
       </w:r>
     </w:p>
     <w:p>
@@ -719,126 +768,13 @@
         <w:spacing w:after="140"/>
       </w:pPr>
       <w:r>
-        <w:t xml:space="preserve">Jeff, Steve and Jack Hanson are three demo mentors so the marketplace isn't empty on day one. Their bios are as serious as you'd expect. You can sign in as any of them to play the mentor side without creating more accounts:</w:t>
-      </w:r>
-    </w:p>
-    <w:p>
-      <w:pPr>
-        <w:numPr>
-          <w:ilvl w:val="0"/>
-          <w:numId w:val="1"/>
-        </w:numPr>
-        <w:spacing w:after="80"/>
-      </w:pPr>
-      <w:r>
-        <w:t xml:space="preserve">admin+jeff.hanson@firstlineperform.com · admin+steve.hanson@firstlineperform.com · admin+jack.hanson@firstlineperform.com</w:t>
-      </w:r>
-    </w:p>
-    <w:p>
-      <w:pPr>
-        <w:numPr>
-          <w:ilvl w:val="0"/>
-          <w:numId w:val="1"/>
-        </w:numPr>
-        <w:spacing w:after="80"/>
-      </w:pPr>
-      <w:r>
-        <w:t xml:space="preserve">Password for all three: </w:t>
-      </w:r>
-      <w:r>
-        <w:rPr>
-          <w:b/>
-        </w:rPr>
-        <w:t xml:space="preserve">OldTimeHockey-1977!</w:t>
-      </w:r>
-    </w:p>
-    <w:p>
-      <w:pPr>
-        <w:spacing w:after="140"/>
-      </w:pPr>
-      <w:r>
-        <w:t xml:space="preserve">They come down before launch.</w:t>
-      </w:r>
-    </w:p>
-    <w:p>
-      <w:pPr>
-        <w:pStyle w:val="Heading2"/>
-      </w:pPr>
-      <w:r>
-        <w:t xml:space="preserve">What's real and what isn't, today</w:t>
-      </w:r>
-    </w:p>
-    <w:p>
-      <w:pPr>
-        <w:numPr>
-          <w:ilvl w:val="0"/>
-          <w:numId w:val="1"/>
-        </w:numPr>
-        <w:spacing w:after="80"/>
-      </w:pPr>
-      <w:r>
-        <w:rPr>
-          <w:b/>
-        </w:rPr>
-        <w:t xml:space="preserve">Real:</w:t>
-      </w:r>
-      <w:r>
-        <w:t xml:space="preserve"> accounts, youth athletes, orders, uploads, breakdowns, worksheets and PDFs, ratings, audits, Film Rooms and their recordings, every email, the admin panel. It all persists.</w:t>
-      </w:r>
-    </w:p>
-    <w:p>
-      <w:pPr>
-        <w:numPr>
-          <w:ilvl w:val="0"/>
-          <w:numId w:val="1"/>
-        </w:numPr>
-        <w:spacing w:after="80"/>
-      </w:pPr>
-      <w:r>
-        <w:rPr>
-          <w:b/>
-        </w:rPr>
-        <w:t xml:space="preserve">Not yet:</w:t>
-      </w:r>
-      <w:r>
-        <w:t xml:space="preserve"> charging cards and paying mentors through Stripe (the switch is built, the account is in progress), the native apps, the finished design, real copy, counsel's legal pages.</w:t>
-      </w:r>
-    </w:p>
-    <w:p>
-      <w:pPr>
-        <w:pStyle w:val="Heading2"/>
-      </w:pPr>
-      <w:r>
-        <w:t xml:space="preserve">How to give feedback</w:t>
-      </w:r>
-    </w:p>
-    <w:p>
-      <w:pPr>
-        <w:spacing w:after="140"/>
-      </w:pPr>
-      <w:r>
-        <w:t xml:space="preserve">Post it to the deck at comms.firstlineperform.com, screenshots welcome, or email me. Kick the tires hard. Break it if you can; that's what this week is for. Then we meet, settle the key points, and I go make it beautiful.</w:t>
+        <w:t xml:space="preserve">Post it to the deck at comms.firstlineperform.com, screenshots welcome, email me, or message me. All good. Kick the tires. Then we meet, settle the open points, and I go make it beautiful.</w:t>
       </w:r>
     </w:p>
     <w:p>
       <w:pPr>
         <w:spacing w:before="200"/>
       </w:pPr>
-      <w:r>
-        <w:rPr>
-          <w:b/>
-        </w:rPr>
-        <w:t xml:space="preserve">Let's get this beautiful beast in the air.</w:t>
-      </w:r>
-      <w:r>
-        <w:t xml:space="preserve"/>
-      </w:r>
-      <w:r>
-        <w:br/>
-      </w:r>
-      <w:r>
-        <w:t xml:space="preserve"/>
-      </w:r>
       <w:r>
         <w:rPr>
           <w:b/>

</xml_diff>

<commit_message>
docs: beta guide rebuilt from the doc at rev 1141
Co-Authored-By: Claude Fable 5.1 <noreply@anthropic.com>
</commit_message>
<xml_diff>
--- a/docs/FLP_Beta_Preview_Guide.docx
+++ b/docs/FLP_Beta_Preview_Guide.docx
@@ -29,6 +29,14 @@
       </w:pPr>
       <w:r>
         <w:t xml:space="preserve">Alex, Bryan: the platform is live on our beta servers, I wanted to send it today because I know it's just plain fun to see your visions become digital reality, and it gives you time to poke around before Sunday's review. Everything you do on it persists, but any Admin can delete anything you make that needs to be pruned as far as mentors or profiles. Keep in mind when you change things on the administrative panel settings page, those are real settings changes. I have multiple "go back to safe settings" features, so just be aware, but don't sweat it. Before you dive in, three things so you see it the way I do.</w:t>
+      </w:r>
+    </w:p>
+    <w:p>
+      <w:pPr>
+        <w:spacing w:after="140"/>
+      </w:pPr>
+      <w:r>
+        <w:t xml:space="preserve">Vastly important: There will be at least one if not many "OH SHIT HOW COULD WE FORGET THAT?" moments. When you build a product like this and some obvious adjacent functionality, or countervailing control work, or just plain missing button, only becomes evident when you drive the car for the first time. When this happens, slap your head, write it down, move on. Anything missing will go in and we'll take another test drive, it's what this pass is for.</w:t>
       </w:r>
     </w:p>
     <w:p>

</xml_diff>